<commit_message>
feat: add terraform labs for week 4 and week 5 with multipass provider and configuration files
</commit_message>
<xml_diff>
--- a/docs/week-report/week-4.docx
+++ b/docs/week-report/week-4.docx
@@ -2,7 +2,7 @@
 <file path=word/document.xml><?xml version="1.0" encoding="utf-8"?>
 <w:document xmlns:w="http://schemas.openxmlformats.org/wordprocessingml/2006/main" xmlns:m="http://schemas.openxmlformats.org/officeDocument/2006/math" xmlns:r="http://schemas.openxmlformats.org/officeDocument/2006/relationships" xmlns:o="urn:schemas-microsoft-com:office:office" xmlns:v="urn:schemas-microsoft-com:vml" xmlns:w10="urn:schemas-microsoft-com:office:word" xmlns:a="http://schemas.openxmlformats.org/drawingml/2006/main" xmlns:pic="http://schemas.openxmlformats.org/drawingml/2006/picture" xmlns:wp="http://schemas.openxmlformats.org/drawingml/2006/wordprocessingDrawing">
   <w:body>
-    <w:bookmarkStart w:id="29" w:name="báo-cáo-tiến-độ-tuần-4"/>
+    <w:bookmarkStart w:id="33" w:name="báo-cáo-tiến-độ-tuần-4"/>
     <w:p>
       <w:pPr>
         <w:pStyle w:val="Heading1"/>
@@ -144,7 +144,7 @@
         </w:pict>
       </w:r>
     </w:p>
-    <w:bookmarkStart w:id="11" w:name="Xb250c361c94419b8d0284aa42ae7798dc46458a"/>
+    <w:bookmarkStart w:id="15" w:name="Xb250c361c94419b8d0284aa42ae7798dc46458a"/>
     <w:p>
       <w:pPr>
         <w:pStyle w:val="Heading2"/>
@@ -161,13 +161,30 @@
         <w:t xml:space="preserve">Trong quy trình phát triển và vận hành hiện đại, việc quản trị hạ tầng thủ công bằng cách gõ lệnh trên từng máy chủ bộc lộ nhiều điểm yếu về thời gian, khả năng kiểm soát phiên bản và tính lặp lại. Terraform là công cụ hạ tầng dưới dạng mã nguồn mã nguồn mở do HashiCorp phát triển, cho phép định nghĩa, cấp phát và quản lý toàn bộ tài nguyên hệ thống thông qua các tệp mã nguồn cấu hình rõ ràng.</w:t>
       </w:r>
     </w:p>
-    <w:bookmarkStart w:id="9" w:name="X0bd465caae6147d72630ec43150f18e14a63a12"/>
+    <w:bookmarkStart w:id="12" w:name="X312bb91405877e3c115c07e29ae8c1472049e7d"/>
     <w:p>
       <w:pPr>
         <w:pStyle w:val="Heading3"/>
       </w:pPr>
       <w:r>
-        <w:t xml:space="preserve">1.1. So sánh mô hình hạ tầng khai báo và mô hình mệnh lệnh</w:t>
+        <w:t xml:space="preserve">1.1. Tại sao phải sử dụng Terraform trong quy trình tự động hóa hạ tầng?</w:t>
+      </w:r>
+    </w:p>
+    <w:bookmarkStart w:id="9" w:name="X70853c1f83cdd1dd05bf884bb5ff3732c27d8f0"/>
+    <w:p>
+      <w:pPr>
+        <w:pStyle w:val="Heading4"/>
+      </w:pPr>
+      <w:r>
+        <w:t xml:space="preserve">1.1.1. Thực trạng và hạn chế nghiêm trọng của phương pháp quản trị truyền thống</w:t>
+      </w:r>
+    </w:p>
+    <w:p>
+      <w:pPr>
+        <w:pStyle w:val="FirstParagraph"/>
+      </w:pPr>
+      <w:r>
+        <w:t xml:space="preserve">Trước khi các công cụ Hạ tầng dưới dạng mã nguồn (IaC) ra đời, việc khởi tạo và quản trị hệ thống máy chủ chủ yếu dựa vào thao tác thủ công (ClickOps hoặc Runbooks):</w:t>
       </w:r>
     </w:p>
     <w:p>
@@ -183,31 +200,13 @@
           <w:b/>
           <w:bCs/>
         </w:rPr>
-        <w:t xml:space="preserve">Mô hình mệnh lệnh:</w:t>
-      </w:r>
-    </w:p>
-    <w:p>
-      <w:pPr>
-        <w:pStyle w:val="Compact"/>
-        <w:numPr>
-          <w:ilvl w:val="1"/>
-          <w:numId w:val="1003"/>
-        </w:numPr>
-      </w:pPr>
-      <w:r>
-        <w:t xml:space="preserve">Người quản trị phải tự tay định nghĩa chi tiết từng bước thực thi: làm thế nào để đạt được trạng thái mong muốn (ví dụ: chạy lệnh kiểm tra xem máy ảo đã có chưa, nếu chưa có thì gõ lệnh tạo, sau đó cấu hình mạng).</w:t>
-      </w:r>
-    </w:p>
-    <w:p>
-      <w:pPr>
-        <w:pStyle w:val="Compact"/>
-        <w:numPr>
-          <w:ilvl w:val="1"/>
-          <w:numId w:val="1003"/>
-        </w:numPr>
-      </w:pPr>
-      <w:r>
-        <w:t xml:space="preserve">Nhược điểm: Phức tạp, dễ phát sinh lỗi khi chạy lại nhiều lần và khó theo dõi sự thay đổi của toàn hệ thống theo thời gian.</w:t>
+        <w:t xml:space="preserve">Tốc độ triển khai chậm chạp:</w:t>
+      </w:r>
+      <w:r>
+        <w:t xml:space="preserve"> </w:t>
+      </w:r>
+      <w:r>
+        <w:t xml:space="preserve">Kỹ sư phải tự tay cài đặt từng máy ảo, thiết lập thông số phần cứng, phân chia mạng và cấp phát địa chỉ IP. Quá trình này mất hàng giờ đến hàng ngày cho một hệ thống hoàn chỉnh.</w:t>
       </w:r>
     </w:p>
     <w:p>
@@ -223,7 +222,132 @@
           <w:b/>
           <w:bCs/>
         </w:rPr>
-        <w:t xml:space="preserve">Mô hình khai báo (Cách tiếp cận của Terraform):</w:t>
+        <w:t xml:space="preserve">Dễ phát sinh sai sót do con người (Human Error):</w:t>
+      </w:r>
+      <w:r>
+        <w:t xml:space="preserve"> </w:t>
+      </w:r>
+      <w:r>
+        <w:t xml:space="preserve">Thao tác gõ lệnh thủ công trên terminal rất dễ xảy ra lỗi nhầm lẫn (nhập sai địa chỉ IP, phân quyền sai, quên bật tường lửa), tạo ra các lỗ hổng bảo mật nghiêm trọng.</w:t>
+      </w:r>
+    </w:p>
+    <w:p>
+      <w:pPr>
+        <w:pStyle w:val="Compact"/>
+        <w:numPr>
+          <w:ilvl w:val="0"/>
+          <w:numId w:val="1002"/>
+        </w:numPr>
+      </w:pPr>
+      <w:r>
+        <w:rPr>
+          <w:b/>
+          <w:bCs/>
+        </w:rPr>
+        <w:t xml:space="preserve">Hiện tượng trôi dạt cấu hình (Configuration Drift):</w:t>
+      </w:r>
+      <w:r>
+        <w:t xml:space="preserve"> </w:t>
+      </w:r>
+      <w:r>
+        <w:t xml:space="preserve">Các can thiệp chỉnh sửa thủ công mang tính</w:t>
+      </w:r>
+      <w:r>
+        <w:t xml:space="preserve"> </w:t>
+      </w:r>
+      <w:r>
+        <w:t xml:space="preserve">“chữa cháy”</w:t>
+      </w:r>
+      <w:r>
+        <w:t xml:space="preserve"> </w:t>
+      </w:r>
+      <w:r>
+        <w:t xml:space="preserve">tức thời trên từng máy chủ khiến môi trường phát triển (Dev), thử nghiệm (Staging) và vận hành (Production) bị lệch pha âm thầm theo thời gian. Đây là nguyên nhân gốc rễ sinh ra lỗi kinh điển:</w:t>
+      </w:r>
+      <w:r>
+        <w:t xml:space="preserve"> </w:t>
+      </w:r>
+      <w:r>
+        <w:rPr>
+          <w:i/>
+          <w:iCs/>
+        </w:rPr>
+        <w:t xml:space="preserve">“Chạy được ở máy cục bộ nhưng lỗi trên máy chủ”</w:t>
+      </w:r>
+      <w:r>
+        <w:t xml:space="preserve">.</w:t>
+      </w:r>
+    </w:p>
+    <w:p>
+      <w:pPr>
+        <w:pStyle w:val="Compact"/>
+        <w:numPr>
+          <w:ilvl w:val="0"/>
+          <w:numId w:val="1002"/>
+        </w:numPr>
+      </w:pPr>
+      <w:r>
+        <w:rPr>
+          <w:b/>
+          <w:bCs/>
+        </w:rPr>
+        <w:t xml:space="preserve">Khủng hoảng khôi phục sau sự cố (Disaster Recovery):</w:t>
+      </w:r>
+      <w:r>
+        <w:t xml:space="preserve"> </w:t>
+      </w:r>
+      <w:r>
+        <w:t xml:space="preserve">Khi máy chủ gặp thảm họa phần cứng hoặc bị sập hoàn toàn, việc tái thiết lập phụ thuộc vào trí nhớ cá nhân hoặc các tài liệu hướng dẫn vốn đã lỗi thời, khiến thời gian gián đoạn dịch vụ kéo dài.</w:t>
+      </w:r>
+    </w:p>
+    <w:bookmarkEnd w:id="9"/>
+    <w:bookmarkStart w:id="10" w:name="X9a2cc675b3e6a5862db02f8db5863412d2a0dd1"/>
+    <w:p>
+      <w:pPr>
+        <w:pStyle w:val="Heading4"/>
+      </w:pPr>
+      <w:r>
+        <w:t xml:space="preserve">1.1.2. Năm lý do then chốt lựa chọn HashiCorp Terraform</w:t>
+      </w:r>
+    </w:p>
+    <w:p>
+      <w:pPr>
+        <w:pStyle w:val="FirstParagraph"/>
+      </w:pPr>
+      <w:r>
+        <w:t xml:space="preserve">Nhằm giải quyết triệt để các bài toán trên, đề tài lựa chọn</w:t>
+      </w:r>
+      <w:r>
+        <w:t xml:space="preserve"> </w:t>
+      </w:r>
+      <w:r>
+        <w:rPr>
+          <w:b/>
+          <w:bCs/>
+        </w:rPr>
+        <w:t xml:space="preserve">HashiCorp Terraform</w:t>
+      </w:r>
+      <w:r>
+        <w:t xml:space="preserve"> </w:t>
+      </w:r>
+      <w:r>
+        <w:t xml:space="preserve">làm công nghệ trụ cột cho tầng khởi tạo hạ tầng nhờ 5 ưu điểm vượt trội:</w:t>
+      </w:r>
+    </w:p>
+    <w:p>
+      <w:pPr>
+        <w:pStyle w:val="Compact"/>
+        <w:numPr>
+          <w:ilvl w:val="0"/>
+          <w:numId w:val="1003"/>
+        </w:numPr>
+      </w:pPr>
+      <w:r>
+        <w:rPr>
+          <w:b/>
+          <w:bCs/>
+        </w:rPr>
+        <w:t xml:space="preserve">Mô hình hạ tầng khai báo (Declarative Approach):</w:t>
       </w:r>
     </w:p>
     <w:p>
@@ -235,7 +359,23 @@
         </w:numPr>
       </w:pPr>
       <w:r>
-        <w:t xml:space="preserve">Người quản trị chỉ cần mô tả trạng thái cuối cùng mong muốn của hệ thống (ví dụ: hệ thống cần có 2 máy chủ với cấu hình 1 vCPU, 1.5 GB RAM và địa chỉ IP xác định).</w:t>
+        <w:t xml:space="preserve">Khác với cách tiếp cận mệnh lệnh (chỉ đạo từng bước thực thi), Terraform cho phép người kỹ sư chỉ cần định nghĩa</w:t>
+      </w:r>
+      <w:r>
+        <w:t xml:space="preserve"> </w:t>
+      </w:r>
+      <w:r>
+        <w:rPr>
+          <w:i/>
+          <w:iCs/>
+        </w:rPr>
+        <w:t xml:space="preserve">trạng thái mong muốn cuối cùng</w:t>
+      </w:r>
+      <w:r>
+        <w:t xml:space="preserve"> </w:t>
+      </w:r>
+      <w:r>
+        <w:t xml:space="preserve">(Desired State) của hệ thống bằng ngôn ngữ HCL (HashiCorp Configuration Language).</w:t>
       </w:r>
     </w:p>
     <w:p>
@@ -247,17 +387,451 @@
         </w:numPr>
       </w:pPr>
       <w:r>
+        <w:t xml:space="preserve">Lõi Terraform sẽ tự động đọc trạng thái thực tế, so sánh với trạng thái khai báo và tự suy diễn chuỗi hành động tối ưu nhất để đưa hệ thống về đúng trạng thái đích.</w:t>
+      </w:r>
+    </w:p>
+    <w:p>
+      <w:pPr>
+        <w:pStyle w:val="Compact"/>
+        <w:numPr>
+          <w:ilvl w:val="0"/>
+          <w:numId w:val="1003"/>
+        </w:numPr>
+      </w:pPr>
+      <w:r>
+        <w:rPr>
+          <w:b/>
+          <w:bCs/>
+        </w:rPr>
+        <w:t xml:space="preserve">Cơ chế quản lý trạng thái (</w:t>
+      </w:r>
+      <w:r>
+        <w:rPr>
+          <w:rStyle w:val="VerbatimChar"/>
+          <w:b/>
+          <w:bCs/>
+        </w:rPr>
+        <w:t xml:space="preserve">terraform.tfstate</w:t>
+      </w:r>
+      <w:r>
+        <w:rPr>
+          <w:b/>
+          <w:bCs/>
+        </w:rPr>
+        <w:t xml:space="preserve">) – Nguồn chân lý duy nhất (Single Source of Truth):</w:t>
+      </w:r>
+    </w:p>
+    <w:p>
+      <w:pPr>
+        <w:pStyle w:val="Compact"/>
+        <w:numPr>
+          <w:ilvl w:val="1"/>
+          <w:numId w:val="1005"/>
+        </w:numPr>
+      </w:pPr>
+      <w:r>
+        <w:t xml:space="preserve">Terraform lưu trữ bản đồ ánh xạ chi tiết giữa mã nguồn HCL và tài nguyên thực tế trong tệp trạng thái</w:t>
+      </w:r>
+      <w:r>
+        <w:t xml:space="preserve"> </w:t>
+      </w:r>
+      <w:r>
+        <w:rPr>
+          <w:rStyle w:val="VerbatimChar"/>
+        </w:rPr>
+        <w:t xml:space="preserve">terraform.tfstate</w:t>
+      </w:r>
+      <w:r>
+        <w:t xml:space="preserve">.</w:t>
+      </w:r>
+    </w:p>
+    <w:p>
+      <w:pPr>
+        <w:pStyle w:val="Compact"/>
+        <w:numPr>
+          <w:ilvl w:val="1"/>
+          <w:numId w:val="1005"/>
+        </w:numPr>
+      </w:pPr>
+      <w:r>
+        <w:t xml:space="preserve">Nhờ có tệp trạng thái, Terraform nắm rõ siêu dữ liệu của từng máy chủ (ID, IP, tài nguyên cấp phát) mà không cần phải quét lại toàn bộ hạ tầng từ đầu. Đây là nền tảng giúp Terraform phát hiện trôi dạt cấu hình và hỗ trợ tự chữa lành (Self-healing).</w:t>
+      </w:r>
+    </w:p>
+    <w:p>
+      <w:pPr>
+        <w:pStyle w:val="Compact"/>
+        <w:numPr>
+          <w:ilvl w:val="0"/>
+          <w:numId w:val="1003"/>
+        </w:numPr>
+      </w:pPr>
+      <w:r>
+        <w:rPr>
+          <w:b/>
+          <w:bCs/>
+        </w:rPr>
+        <w:t xml:space="preserve">Khả năng dự báo trước thay đổi qua kế hoạch thực thi (</w:t>
+      </w:r>
+      <w:r>
+        <w:rPr>
+          <w:rStyle w:val="VerbatimChar"/>
+          <w:b/>
+          <w:bCs/>
+        </w:rPr>
+        <w:t xml:space="preserve">Execution Plan</w:t>
+      </w:r>
+      <w:r>
+        <w:rPr>
+          <w:b/>
+          <w:bCs/>
+        </w:rPr>
+        <w:t xml:space="preserve">):</w:t>
+      </w:r>
+    </w:p>
+    <w:p>
+      <w:pPr>
+        <w:pStyle w:val="Compact"/>
+        <w:numPr>
+          <w:ilvl w:val="1"/>
+          <w:numId w:val="1006"/>
+        </w:numPr>
+      </w:pPr>
+      <w:r>
+        <w:t xml:space="preserve">Lệnh</w:t>
+      </w:r>
+      <w:r>
+        <w:t xml:space="preserve"> </w:t>
+      </w:r>
+      <w:r>
+        <w:rPr>
+          <w:rStyle w:val="VerbatimChar"/>
+        </w:rPr>
+        <w:t xml:space="preserve">terraform plan</w:t>
+      </w:r>
+      <w:r>
+        <w:t xml:space="preserve"> </w:t>
+      </w:r>
+      <w:r>
+        <w:t xml:space="preserve">là lớp phòng vệ an toàn tuyệt đối. Trước khi áp dụng bất kỳ thay đổi nào vào hạ tầng thực tế, Terraform luôn hiển thị bản tóm tắt chi tiết các hành động sẽ diễn ra: thêm mới (</w:t>
+      </w:r>
+      <w:r>
+        <w:rPr>
+          <w:rStyle w:val="VerbatimChar"/>
+        </w:rPr>
+        <w:t xml:space="preserve">+</w:t>
+      </w:r>
+      <w:r>
+        <w:t xml:space="preserve">), sửa đổi tại chỗ (</w:t>
+      </w:r>
+      <w:r>
+        <w:rPr>
+          <w:rStyle w:val="VerbatimChar"/>
+        </w:rPr>
+        <w:t xml:space="preserve">~</w:t>
+      </w:r>
+      <w:r>
+        <w:t xml:space="preserve">), xóa bỏ (</w:t>
+      </w:r>
+      <w:r>
+        <w:rPr>
+          <w:rStyle w:val="VerbatimChar"/>
+        </w:rPr>
+        <w:t xml:space="preserve">-</w:t>
+      </w:r>
+      <w:r>
+        <w:t xml:space="preserve">) hoặc thay thế (</w:t>
+      </w:r>
+      <w:r>
+        <w:rPr>
+          <w:rStyle w:val="VerbatimChar"/>
+        </w:rPr>
+        <w:t xml:space="preserve">-/+</w:t>
+      </w:r>
+      <w:r>
+        <w:t xml:space="preserve">). Điều này loại bỏ hoàn toàn nguy cơ vô tình xóa nhầm tài nguyên trên máy chủ.</w:t>
+      </w:r>
+    </w:p>
+    <w:p>
+      <w:pPr>
+        <w:pStyle w:val="Compact"/>
+        <w:numPr>
+          <w:ilvl w:val="0"/>
+          <w:numId w:val="1003"/>
+        </w:numPr>
+      </w:pPr>
+      <w:r>
+        <w:rPr>
+          <w:b/>
+          <w:bCs/>
+        </w:rPr>
+        <w:t xml:space="preserve">Tính nhất quán và an toàn tuyệt đối (Idempotency):</w:t>
+      </w:r>
+    </w:p>
+    <w:p>
+      <w:pPr>
+        <w:pStyle w:val="Compact"/>
+        <w:numPr>
+          <w:ilvl w:val="1"/>
+          <w:numId w:val="1007"/>
+        </w:numPr>
+      </w:pPr>
+      <w:r>
+        <w:t xml:space="preserve">Kịch bản Terraform đảm bảo tính lặp lại: dù chạy 1 lần hay 100 lần thì kết quả đạt được vẫn là một trạng thái hạ tầng duy nhất, không sinh ra máy ảo trùng lặp hay gây xung đột tài nguyên.</w:t>
+      </w:r>
+    </w:p>
+    <w:p>
+      <w:pPr>
+        <w:pStyle w:val="Compact"/>
+        <w:numPr>
+          <w:ilvl w:val="0"/>
+          <w:numId w:val="1003"/>
+        </w:numPr>
+      </w:pPr>
+      <w:r>
+        <w:rPr>
+          <w:b/>
+          <w:bCs/>
+        </w:rPr>
+        <w:t xml:space="preserve">Độc lập nền tảng và hỗ trợ đa nhà cung cấp (Cloud-Agnostic &amp; Multi-Provider):</w:t>
+      </w:r>
+    </w:p>
+    <w:p>
+      <w:pPr>
+        <w:pStyle w:val="Compact"/>
+        <w:numPr>
+          <w:ilvl w:val="1"/>
+          <w:numId w:val="1008"/>
+        </w:numPr>
+      </w:pPr>
+      <w:r>
+        <w:t xml:space="preserve">Terraform không bị trói buộc vào một nền tảng độc quyền nào (tránh Vendor Lock-in). Cùng một tư duy và cú pháp HCL, kỹ sư có thể quản lý máy ảo cục bộ bằng Canonical Multipass, VMware, Docker hoặc mở rộng lên các nền tảng đám mây hàng đầu như AWS, Google Cloud, Microsoft Azure.</w:t>
+      </w:r>
+    </w:p>
+    <w:bookmarkEnd w:id="10"/>
+    <w:bookmarkStart w:id="11" w:name="X5dbf76b684789b72cc467e9673abfef19ef31d0"/>
+    <w:p>
+      <w:pPr>
+        <w:pStyle w:val="Heading4"/>
+      </w:pPr>
+      <w:r>
+        <w:t xml:space="preserve">1.1.3. Phân định vai trò: Tại sao dùng Terraform mà không dùng Shell Script hay chỉ dùng Ansible?</w:t>
+      </w:r>
+    </w:p>
+    <w:p>
+      <w:pPr>
+        <w:pStyle w:val="Compact"/>
+        <w:numPr>
+          <w:ilvl w:val="0"/>
+          <w:numId w:val="1009"/>
+        </w:numPr>
+      </w:pPr>
+      <w:r>
+        <w:rPr>
+          <w:b/>
+          <w:bCs/>
+        </w:rPr>
+        <w:t xml:space="preserve">So với Shell Script (Bash):</w:t>
+      </w:r>
+      <w:r>
+        <w:t xml:space="preserve"> </w:t>
+      </w:r>
+      <w:r>
+        <w:t xml:space="preserve">Shell script thuần túy mang tính mệnh lệnh, không có cơ chế quản lý trạng thái, không tự động tính toán đồ thị phụ thuộc (Dependency Graph) và rất khó kiểm soát lỗi khi hệ thống mở rộng quy mô.</w:t>
+      </w:r>
+    </w:p>
+    <w:p>
+      <w:pPr>
+        <w:pStyle w:val="Compact"/>
+        <w:numPr>
+          <w:ilvl w:val="0"/>
+          <w:numId w:val="1009"/>
+        </w:numPr>
+      </w:pPr>
+      <w:r>
+        <w:rPr>
+          <w:b/>
+          <w:bCs/>
+        </w:rPr>
+        <w:t xml:space="preserve">So với Ansible (Cấp phát vs Quản lý cấu hình):</w:t>
+      </w:r>
+    </w:p>
+    <w:p>
+      <w:pPr>
+        <w:pStyle w:val="Compact"/>
+        <w:numPr>
+          <w:ilvl w:val="1"/>
+          <w:numId w:val="1010"/>
+        </w:numPr>
+      </w:pPr>
+      <w:r>
+        <w:rPr>
+          <w:i/>
+          <w:iCs/>
+        </w:rPr>
+        <w:t xml:space="preserve">Terraform (Tầng cấp phát - Provisioning):</w:t>
+      </w:r>
+      <w:r>
+        <w:t xml:space="preserve"> </w:t>
+      </w:r>
+      <w:r>
+        <w:t xml:space="preserve">Xuất sắc nhất trong việc tạo lập máy ảo từ con số 0, định hình tài nguyên phần cứng (CPU, RAM, Đĩa) và thiết lập mạng nội bộ.</w:t>
+      </w:r>
+    </w:p>
+    <w:p>
+      <w:pPr>
+        <w:pStyle w:val="Compact"/>
+        <w:numPr>
+          <w:ilvl w:val="1"/>
+          <w:numId w:val="1010"/>
+        </w:numPr>
+      </w:pPr>
+      <w:r>
+        <w:rPr>
+          <w:i/>
+          <w:iCs/>
+        </w:rPr>
+        <w:t xml:space="preserve">Ansible (Tầng cấu hình - Configuration Management):</w:t>
+      </w:r>
+      <w:r>
+        <w:t xml:space="preserve"> </w:t>
+      </w:r>
+      <w:r>
+        <w:t xml:space="preserve">Xuất sắc nhất trong việc kết nối vào máy chủ có sẵn qua SSH để cài đặt phần mềm, cấu hình dịch vụ, thiết lập bảo mật và điều phối ứng dụng.</w:t>
+      </w:r>
+    </w:p>
+    <w:p>
+      <w:pPr>
+        <w:pStyle w:val="Compact"/>
+        <w:numPr>
+          <w:ilvl w:val="1"/>
+          <w:numId w:val="1010"/>
+        </w:numPr>
+      </w:pPr>
+      <w:r>
+        <w:rPr>
+          <w:i/>
+          <w:iCs/>
+        </w:rPr>
+        <w:t xml:space="preserve">Sự kết hợp tối ưu:</w:t>
+      </w:r>
+      <w:r>
+        <w:t xml:space="preserve"> </w:t>
+      </w:r>
+      <w:r>
+        <w:t xml:space="preserve">Terraform tự động sinh máy ảo và xuất ra tệp danh mục</w:t>
+      </w:r>
+      <w:r>
+        <w:t xml:space="preserve"> </w:t>
+      </w:r>
+      <w:r>
+        <w:rPr>
+          <w:rStyle w:val="VerbatimChar"/>
+        </w:rPr>
+        <w:t xml:space="preserve">inventory.ini</w:t>
+      </w:r>
+      <w:r>
+        <w:t xml:space="preserve">, sau đó Ansible đọc tệp danh mục này để cấu hình hệ điều hành. Phân chia ranh giới rõ ràng giúp hệ thống đạt tính mô-đun hóa cao, dễ bảo trì và vận hành chuẩn mực theo văn hóa DevOps.</w:t>
+      </w:r>
+    </w:p>
+    <w:bookmarkEnd w:id="11"/>
+    <w:bookmarkEnd w:id="12"/>
+    <w:bookmarkStart w:id="13" w:name="X0bd465caae6147d72630ec43150f18e14a63a12"/>
+    <w:p>
+      <w:pPr>
+        <w:pStyle w:val="Heading3"/>
+      </w:pPr>
+      <w:r>
+        <w:t xml:space="preserve">1.2. So sánh mô hình hạ tầng khai báo và mô hình mệnh lệnh</w:t>
+      </w:r>
+    </w:p>
+    <w:p>
+      <w:pPr>
+        <w:pStyle w:val="Compact"/>
+        <w:numPr>
+          <w:ilvl w:val="0"/>
+          <w:numId w:val="1011"/>
+        </w:numPr>
+      </w:pPr>
+      <w:r>
+        <w:rPr>
+          <w:b/>
+          <w:bCs/>
+        </w:rPr>
+        <w:t xml:space="preserve">Mô hình mệnh lệnh:</w:t>
+      </w:r>
+    </w:p>
+    <w:p>
+      <w:pPr>
+        <w:pStyle w:val="Compact"/>
+        <w:numPr>
+          <w:ilvl w:val="1"/>
+          <w:numId w:val="1012"/>
+        </w:numPr>
+      </w:pPr>
+      <w:r>
+        <w:t xml:space="preserve">Người quản trị phải tự tay định nghĩa chi tiết từng bước thực thi: làm thế nào để đạt được trạng thái mong muốn (ví dụ: chạy lệnh kiểm tra xem máy ảo đã có chưa, nếu chưa có thì gõ lệnh tạo, sau đó cấu hình mạng).</w:t>
+      </w:r>
+    </w:p>
+    <w:p>
+      <w:pPr>
+        <w:pStyle w:val="Compact"/>
+        <w:numPr>
+          <w:ilvl w:val="1"/>
+          <w:numId w:val="1012"/>
+        </w:numPr>
+      </w:pPr>
+      <w:r>
+        <w:t xml:space="preserve">Nhược điểm: Phức tạp, dễ phát sinh lỗi khi chạy lại nhiều lần và khó theo dõi sự thay đổi của toàn hệ thống theo thời gian.</w:t>
+      </w:r>
+    </w:p>
+    <w:p>
+      <w:pPr>
+        <w:pStyle w:val="Compact"/>
+        <w:numPr>
+          <w:ilvl w:val="0"/>
+          <w:numId w:val="1011"/>
+        </w:numPr>
+      </w:pPr>
+      <w:r>
+        <w:rPr>
+          <w:b/>
+          <w:bCs/>
+        </w:rPr>
+        <w:t xml:space="preserve">Mô hình khai báo (Cách tiếp cận của Terraform):</w:t>
+      </w:r>
+    </w:p>
+    <w:p>
+      <w:pPr>
+        <w:pStyle w:val="Compact"/>
+        <w:numPr>
+          <w:ilvl w:val="1"/>
+          <w:numId w:val="1013"/>
+        </w:numPr>
+      </w:pPr>
+      <w:r>
+        <w:t xml:space="preserve">Người quản trị chỉ cần mô tả trạng thái cuối cùng mong muốn của hệ thống (ví dụ: hệ thống cần có 2 máy chủ với cấu hình 1 vCPU, 1.5 GB RAM và địa chỉ IP xác định).</w:t>
+      </w:r>
+    </w:p>
+    <w:p>
+      <w:pPr>
+        <w:pStyle w:val="Compact"/>
+        <w:numPr>
+          <w:ilvl w:val="1"/>
+          <w:numId w:val="1013"/>
+        </w:numPr>
+      </w:pPr>
+      <w:r>
         <w:t xml:space="preserve">Terraform sẽ tự động tính toán trạng thái hiện tại, so sánh với trạng thái khai báo và tự đưa ra chuỗi hành động tối ưu để đưa hệ thống về đúng trạng thái đích.</w:t>
       </w:r>
     </w:p>
-    <w:bookmarkEnd w:id="9"/>
-    <w:bookmarkStart w:id="10" w:name="kiến-trúc-hoạt-động-của-terraform"/>
+    <w:bookmarkEnd w:id="13"/>
+    <w:bookmarkStart w:id="14" w:name="kiến-trúc-hoạt-động-của-terraform"/>
     <w:p>
       <w:pPr>
         <w:pStyle w:val="Heading3"/>
       </w:pPr>
       <w:r>
-        <w:t xml:space="preserve">1.2. Kiến trúc hoạt động của Terraform</w:t>
+        <w:t xml:space="preserve">1.3. Kiến trúc hoạt động của Terraform</w:t>
       </w:r>
     </w:p>
     <w:p>
@@ -319,9 +893,9 @@
         </w:pict>
       </w:r>
     </w:p>
-    <w:bookmarkEnd w:id="10"/>
-    <w:bookmarkEnd w:id="11"/>
-    <w:bookmarkStart w:id="17" w:name="vòng-đời-lệnh-cốt-lõi-của-terraform"/>
+    <w:bookmarkEnd w:id="14"/>
+    <w:bookmarkEnd w:id="15"/>
+    <w:bookmarkStart w:id="21" w:name="vòng-đời-lệnh-cốt-lõi-của-terraform"/>
     <w:p>
       <w:pPr>
         <w:pStyle w:val="Heading2"/>
@@ -574,7 +1148,7 @@
         <w:t xml:space="preserve">+-----------------------+</w:t>
       </w:r>
     </w:p>
-    <w:bookmarkStart w:id="12" w:name="lệnh-khởi-tạo-môi-trường-terraform-init"/>
+    <w:bookmarkStart w:id="16" w:name="lệnh-khởi-tạo-môi-trường-terraform-init"/>
     <w:p>
       <w:pPr>
         <w:pStyle w:val="Heading3"/>
@@ -596,7 +1170,7 @@
       <w:pPr>
         <w:numPr>
           <w:ilvl w:val="0"/>
-          <w:numId w:val="1005"/>
+          <w:numId w:val="1014"/>
         </w:numPr>
       </w:pPr>
       <w:r>
@@ -644,7 +1218,7 @@
       <w:pPr>
         <w:numPr>
           <w:ilvl w:val="0"/>
-          <w:numId w:val="1005"/>
+          <w:numId w:val="1014"/>
         </w:numPr>
       </w:pPr>
       <w:r>
@@ -676,8 +1250,8 @@
         <w:t xml:space="preserve"> init</w:t>
       </w:r>
     </w:p>
-    <w:bookmarkEnd w:id="12"/>
-    <w:bookmarkStart w:id="13" w:name="lệnh-kiểm-tra-cú-pháp-terraform-validate"/>
+    <w:bookmarkEnd w:id="16"/>
+    <w:bookmarkStart w:id="17" w:name="lệnh-kiểm-tra-cú-pháp-terraform-validate"/>
     <w:p>
       <w:pPr>
         <w:pStyle w:val="Heading3"/>
@@ -699,7 +1273,7 @@
       <w:pPr>
         <w:numPr>
           <w:ilvl w:val="0"/>
-          <w:numId w:val="1006"/>
+          <w:numId w:val="1015"/>
         </w:numPr>
       </w:pPr>
       <w:r>
@@ -720,7 +1294,7 @@
       <w:pPr>
         <w:numPr>
           <w:ilvl w:val="0"/>
-          <w:numId w:val="1006"/>
+          <w:numId w:val="1015"/>
         </w:numPr>
       </w:pPr>
       <w:r>
@@ -752,8 +1326,8 @@
         <w:t xml:space="preserve"> validate</w:t>
       </w:r>
     </w:p>
-    <w:bookmarkEnd w:id="13"/>
-    <w:bookmarkStart w:id="14" w:name="X25667217392a086e704efff568b395148c521c7"/>
+    <w:bookmarkEnd w:id="17"/>
+    <w:bookmarkStart w:id="18" w:name="X25667217392a086e704efff568b395148c521c7"/>
     <w:p>
       <w:pPr>
         <w:pStyle w:val="Heading3"/>
@@ -775,7 +1349,7 @@
       <w:pPr>
         <w:numPr>
           <w:ilvl w:val="0"/>
-          <w:numId w:val="1007"/>
+          <w:numId w:val="1016"/>
         </w:numPr>
       </w:pPr>
       <w:r>
@@ -796,7 +1370,7 @@
       <w:pPr>
         <w:numPr>
           <w:ilvl w:val="0"/>
-          <w:numId w:val="1007"/>
+          <w:numId w:val="1016"/>
         </w:numPr>
       </w:pPr>
       <w:r>
@@ -812,7 +1386,7 @@
         <w:pStyle w:val="Compact"/>
         <w:numPr>
           <w:ilvl w:val="1"/>
-          <w:numId w:val="1008"/>
+          <w:numId w:val="1017"/>
         </w:numPr>
       </w:pPr>
       <w:r>
@@ -833,7 +1407,7 @@
         <w:pStyle w:val="Compact"/>
         <w:numPr>
           <w:ilvl w:val="1"/>
-          <w:numId w:val="1008"/>
+          <w:numId w:val="1017"/>
         </w:numPr>
       </w:pPr>
       <w:r>
@@ -854,7 +1428,7 @@
         <w:pStyle w:val="Compact"/>
         <w:numPr>
           <w:ilvl w:val="1"/>
-          <w:numId w:val="1008"/>
+          <w:numId w:val="1017"/>
         </w:numPr>
       </w:pPr>
       <w:r>
@@ -875,7 +1449,7 @@
         <w:pStyle w:val="Compact"/>
         <w:numPr>
           <w:ilvl w:val="1"/>
-          <w:numId w:val="1008"/>
+          <w:numId w:val="1017"/>
         </w:numPr>
       </w:pPr>
       <w:r>
@@ -895,7 +1469,7 @@
       <w:pPr>
         <w:numPr>
           <w:ilvl w:val="0"/>
-          <w:numId w:val="1007"/>
+          <w:numId w:val="1016"/>
         </w:numPr>
       </w:pPr>
       <w:r>
@@ -945,8 +1519,8 @@
         <w:t xml:space="preserve">tfplan.binary</w:t>
       </w:r>
     </w:p>
-    <w:bookmarkEnd w:id="14"/>
-    <w:bookmarkStart w:id="15" w:name="lệnh-áp-dụng-thay-đổi-terraform-apply"/>
+    <w:bookmarkEnd w:id="18"/>
+    <w:bookmarkStart w:id="19" w:name="lệnh-áp-dụng-thay-đổi-terraform-apply"/>
     <w:p>
       <w:pPr>
         <w:pStyle w:val="Heading3"/>
@@ -968,7 +1542,7 @@
       <w:pPr>
         <w:numPr>
           <w:ilvl w:val="0"/>
-          <w:numId w:val="1009"/>
+          <w:numId w:val="1018"/>
         </w:numPr>
       </w:pPr>
       <w:r>
@@ -989,7 +1563,7 @@
       <w:pPr>
         <w:numPr>
           <w:ilvl w:val="0"/>
-          <w:numId w:val="1009"/>
+          <w:numId w:val="1018"/>
         </w:numPr>
       </w:pPr>
       <w:r>
@@ -1021,8 +1595,8 @@
         <w:t xml:space="preserve"> apply tfplan.binary</w:t>
       </w:r>
     </w:p>
-    <w:bookmarkEnd w:id="15"/>
-    <w:bookmarkStart w:id="16" w:name="Xfd41f0a1474245278082d753a1519e5c99d6a44"/>
+    <w:bookmarkEnd w:id="19"/>
+    <w:bookmarkStart w:id="20" w:name="Xfd41f0a1474245278082d753a1519e5c99d6a44"/>
     <w:p>
       <w:pPr>
         <w:pStyle w:val="Heading3"/>
@@ -1044,7 +1618,7 @@
       <w:pPr>
         <w:numPr>
           <w:ilvl w:val="0"/>
-          <w:numId w:val="1010"/>
+          <w:numId w:val="1019"/>
         </w:numPr>
       </w:pPr>
       <w:r>
@@ -1065,7 +1639,7 @@
       <w:pPr>
         <w:numPr>
           <w:ilvl w:val="0"/>
-          <w:numId w:val="1010"/>
+          <w:numId w:val="1019"/>
         </w:numPr>
       </w:pPr>
       <w:r>
@@ -1110,9 +1684,9 @@
         </w:pict>
       </w:r>
     </w:p>
-    <w:bookmarkEnd w:id="16"/>
-    <w:bookmarkEnd w:id="17"/>
-    <w:bookmarkStart w:id="20" w:name="X40f191e2fc564a1771786b61da802ea881359b2"/>
+    <w:bookmarkEnd w:id="20"/>
+    <w:bookmarkEnd w:id="21"/>
+    <w:bookmarkStart w:id="24" w:name="X40f191e2fc564a1771786b61da802ea881359b2"/>
     <w:p>
       <w:pPr>
         <w:pStyle w:val="Heading2"/>
@@ -1121,7 +1695,7 @@
         <w:t xml:space="preserve">3. Bản chất tệp trạng thái và cơ chế phát hiện trôi dạt cấu hình</w:t>
       </w:r>
     </w:p>
-    <w:bookmarkStart w:id="18" w:name="X0e8ef3498cb4e28b368492e9738d4f7cafed5d4"/>
+    <w:bookmarkStart w:id="22" w:name="X0e8ef3498cb4e28b368492e9738d4f7cafed5d4"/>
     <w:p>
       <w:pPr>
         <w:pStyle w:val="Heading3"/>
@@ -1144,7 +1718,7 @@
         <w:pStyle w:val="Compact"/>
         <w:numPr>
           <w:ilvl w:val="0"/>
-          <w:numId w:val="1011"/>
+          <w:numId w:val="1020"/>
         </w:numPr>
       </w:pPr>
       <w:r>
@@ -1171,15 +1745,15 @@
         <w:pStyle w:val="Compact"/>
         <w:numPr>
           <w:ilvl w:val="0"/>
-          <w:numId w:val="1011"/>
+          <w:numId w:val="1020"/>
         </w:numPr>
       </w:pPr>
       <w:r>
         <w:t xml:space="preserve">Nhờ có tệp trạng thái, Terraform biết chính xác thuộc tính nào đã tồn tại mà không cần phải truy vấn lại toàn bộ hạ tầng từ con số 0 trong mỗi thao tác, đồng thời phát hiện được những tài nguyên nào bị xóa ngoài luồng.</w:t>
       </w:r>
     </w:p>
-    <w:bookmarkEnd w:id="18"/>
-    <w:bookmarkStart w:id="19" w:name="cơ-chế-phát-hiện-trôi-dạt-cấu-hình"/>
+    <w:bookmarkEnd w:id="22"/>
+    <w:bookmarkStart w:id="23" w:name="cơ-chế-phát-hiện-trôi-dạt-cấu-hình"/>
     <w:p>
       <w:pPr>
         <w:pStyle w:val="Heading3"/>
@@ -1193,7 +1767,7 @@
         <w:pStyle w:val="Compact"/>
         <w:numPr>
           <w:ilvl w:val="0"/>
-          <w:numId w:val="1012"/>
+          <w:numId w:val="1021"/>
         </w:numPr>
       </w:pPr>
       <w:r>
@@ -1215,7 +1789,7 @@
         <w:pStyle w:val="Compact"/>
         <w:numPr>
           <w:ilvl w:val="0"/>
-          <w:numId w:val="1012"/>
+          <w:numId w:val="1021"/>
         </w:numPr>
       </w:pPr>
       <w:r>
@@ -1249,7 +1823,7 @@
         <w:pStyle w:val="Compact"/>
         <w:numPr>
           <w:ilvl w:val="1"/>
-          <w:numId w:val="1013"/>
+          <w:numId w:val="1022"/>
         </w:numPr>
       </w:pPr>
       <w:r>
@@ -1261,7 +1835,7 @@
         <w:pStyle w:val="Compact"/>
         <w:numPr>
           <w:ilvl w:val="1"/>
-          <w:numId w:val="1013"/>
+          <w:numId w:val="1022"/>
         </w:numPr>
       </w:pPr>
       <w:r>
@@ -1288,7 +1862,7 @@
         <w:pStyle w:val="Compact"/>
         <w:numPr>
           <w:ilvl w:val="1"/>
-          <w:numId w:val="1013"/>
+          <w:numId w:val="1022"/>
         </w:numPr>
       </w:pPr>
       <w:r>
@@ -1302,9 +1876,9 @@
         </w:pict>
       </w:r>
     </w:p>
-    <w:bookmarkEnd w:id="19"/>
-    <w:bookmarkEnd w:id="20"/>
-    <w:bookmarkStart w:id="24" w:name="X08fa1cfa2faea3ff413bbc4a8a01e694e32057d"/>
+    <w:bookmarkEnd w:id="23"/>
+    <w:bookmarkEnd w:id="24"/>
+    <w:bookmarkStart w:id="28" w:name="X08fa1cfa2faea3ff413bbc4a8a01e694e32057d"/>
     <w:p>
       <w:pPr>
         <w:pStyle w:val="Heading2"/>
@@ -1368,7 +1942,7 @@
         <w:t xml:space="preserve">└── outputs.tf       # Khai báo các giá trị cần xuất ra ngoài</w:t>
       </w:r>
     </w:p>
-    <w:bookmarkStart w:id="21" w:name="tệp-khai-báo-biến-đầu-vào-variables.tf"/>
+    <w:bookmarkStart w:id="25" w:name="tệp-khai-báo-biến-đầu-vào-variables.tf"/>
     <w:p>
       <w:pPr>
         <w:pStyle w:val="Heading3"/>
@@ -1829,8 +2403,8 @@
         <w:t xml:space="preserve">}</w:t>
       </w:r>
     </w:p>
-    <w:bookmarkEnd w:id="21"/>
-    <w:bookmarkStart w:id="22" w:name="tệp-điều-phối-và-cấp-phát-chính-main.tf"/>
+    <w:bookmarkEnd w:id="25"/>
+    <w:bookmarkStart w:id="26" w:name="tệp-điều-phối-và-cấp-phát-chính-main.tf"/>
     <w:p>
       <w:pPr>
         <w:pStyle w:val="Heading3"/>
@@ -2153,8 +2727,8 @@
         <w:t xml:space="preserve">}</w:t>
       </w:r>
     </w:p>
-    <w:bookmarkEnd w:id="22"/>
-    <w:bookmarkStart w:id="23" w:name="X96ad1d38c8c4abba9c466637bf9553bac47f9f5"/>
+    <w:bookmarkEnd w:id="26"/>
+    <w:bookmarkStart w:id="27" w:name="X96ad1d38c8c4abba9c466637bf9553bac47f9f5"/>
     <w:p>
       <w:pPr>
         <w:pStyle w:val="Heading3"/>
@@ -2349,9 +2923,9 @@
         </w:pict>
       </w:r>
     </w:p>
-    <w:bookmarkEnd w:id="23"/>
-    <w:bookmarkEnd w:id="24"/>
-    <w:bookmarkStart w:id="27" w:name="Xc32d1b0a2db7d20ea678608b44bcef0ff68dde4"/>
+    <w:bookmarkEnd w:id="27"/>
+    <w:bookmarkEnd w:id="28"/>
+    <w:bookmarkStart w:id="31" w:name="Xc32d1b0a2db7d20ea678608b44bcef0ff68dde4"/>
     <w:p>
       <w:pPr>
         <w:pStyle w:val="Heading2"/>
@@ -2360,7 +2934,7 @@
         <w:t xml:space="preserve">5. Kết quả thực nghiệm và đánh giá chất lượng</w:t>
       </w:r>
     </w:p>
-    <w:bookmarkStart w:id="25" w:name="Xf0a88777c6dc62c11e07e56356cc27b1cf4d171"/>
+    <w:bookmarkStart w:id="29" w:name="Xf0a88777c6dc62c11e07e56356cc27b1cf4d171"/>
     <w:p>
       <w:pPr>
         <w:pStyle w:val="Heading3"/>
@@ -2701,8 +3275,8 @@
         </w:tc>
       </w:tr>
     </w:tbl>
-    <w:bookmarkEnd w:id="25"/>
-    <w:bookmarkStart w:id="26" w:name="X4f2917288ac341e4a1b706e8f6daf8e791eb237"/>
+    <w:bookmarkEnd w:id="29"/>
+    <w:bookmarkStart w:id="30" w:name="X4f2917288ac341e4a1b706e8f6daf8e791eb237"/>
     <w:p>
       <w:pPr>
         <w:pStyle w:val="Heading3"/>
@@ -2716,7 +3290,7 @@
         <w:pStyle w:val="Compact"/>
         <w:numPr>
           <w:ilvl w:val="0"/>
-          <w:numId w:val="1014"/>
+          <w:numId w:val="1023"/>
         </w:numPr>
       </w:pPr>
       <w:r>
@@ -2738,7 +3312,7 @@
         <w:pStyle w:val="Compact"/>
         <w:numPr>
           <w:ilvl w:val="0"/>
-          <w:numId w:val="1014"/>
+          <w:numId w:val="1023"/>
         </w:numPr>
       </w:pPr>
       <w:r>
@@ -2760,7 +3334,7 @@
         <w:pStyle w:val="Compact"/>
         <w:numPr>
           <w:ilvl w:val="0"/>
-          <w:numId w:val="1014"/>
+          <w:numId w:val="1023"/>
         </w:numPr>
       </w:pPr>
       <w:r>
@@ -2799,9 +3373,9 @@
         </w:pict>
       </w:r>
     </w:p>
-    <w:bookmarkEnd w:id="26"/>
-    <w:bookmarkEnd w:id="27"/>
-    <w:bookmarkStart w:id="28" w:name="Xb6c187d80bd3f36cd598081bc9426fb0cccb68d"/>
+    <w:bookmarkEnd w:id="30"/>
+    <w:bookmarkEnd w:id="31"/>
+    <w:bookmarkStart w:id="32" w:name="Xb6c187d80bd3f36cd598081bc9426fb0cccb68d"/>
     <w:p>
       <w:pPr>
         <w:pStyle w:val="Heading2"/>
@@ -2815,7 +3389,7 @@
         <w:pStyle w:val="Compact"/>
         <w:numPr>
           <w:ilvl w:val="0"/>
-          <w:numId w:val="1015"/>
+          <w:numId w:val="1024"/>
         </w:numPr>
       </w:pPr>
       <w:r>
@@ -2885,7 +3459,7 @@
         <w:pStyle w:val="Compact"/>
         <w:numPr>
           <w:ilvl w:val="0"/>
-          <w:numId w:val="1015"/>
+          <w:numId w:val="1024"/>
         </w:numPr>
       </w:pPr>
       <w:r>
@@ -2917,8 +3491,8 @@
         <w:t xml:space="preserve">cho Ansible thông qua hàm nội suy mẫu, và kiểm tra tính nhất quán khi chạy lại nhiều lần.</w:t>
       </w:r>
     </w:p>
-    <w:bookmarkEnd w:id="28"/>
-    <w:bookmarkEnd w:id="29"/>
+    <w:bookmarkEnd w:id="32"/>
+    <w:bookmarkEnd w:id="33"/>
     <w:sectPr>
       <w:footnotePr>
         <w:numRestart w:val="eachSect"/>
@@ -3227,7 +3801,34 @@
     <w:abstractNumId w:val="991"/>
   </w:num>
   <w:num w:numId="1003">
-    <w:abstractNumId w:val="991"/>
+    <w:abstractNumId w:val="99411"/>
+    <w:lvlOverride w:ilvl="0">
+      <w:startOverride w:val="1"/>
+    </w:lvlOverride>
+    <w:lvlOverride w:ilvl="1">
+      <w:startOverride w:val="1"/>
+    </w:lvlOverride>
+    <w:lvlOverride w:ilvl="2">
+      <w:startOverride w:val="1"/>
+    </w:lvlOverride>
+    <w:lvlOverride w:ilvl="3">
+      <w:startOverride w:val="1"/>
+    </w:lvlOverride>
+    <w:lvlOverride w:ilvl="4">
+      <w:startOverride w:val="1"/>
+    </w:lvlOverride>
+    <w:lvlOverride w:ilvl="5">
+      <w:startOverride w:val="1"/>
+    </w:lvlOverride>
+    <w:lvlOverride w:ilvl="6">
+      <w:startOverride w:val="1"/>
+    </w:lvlOverride>
+    <w:lvlOverride w:ilvl="7">
+      <w:startOverride w:val="1"/>
+    </w:lvlOverride>
+    <w:lvlOverride w:ilvl="8">
+      <w:startOverride w:val="1"/>
+    </w:lvlOverride>
   </w:num>
   <w:num w:numId="1004">
     <w:abstractNumId w:val="991"/>
@@ -3257,6 +3858,33 @@
     <w:abstractNumId w:val="991"/>
   </w:num>
   <w:num w:numId="1013">
+    <w:abstractNumId w:val="991"/>
+  </w:num>
+  <w:num w:numId="1014">
+    <w:abstractNumId w:val="991"/>
+  </w:num>
+  <w:num w:numId="1015">
+    <w:abstractNumId w:val="991"/>
+  </w:num>
+  <w:num w:numId="1016">
+    <w:abstractNumId w:val="991"/>
+  </w:num>
+  <w:num w:numId="1017">
+    <w:abstractNumId w:val="991"/>
+  </w:num>
+  <w:num w:numId="1018">
+    <w:abstractNumId w:val="991"/>
+  </w:num>
+  <w:num w:numId="1019">
+    <w:abstractNumId w:val="991"/>
+  </w:num>
+  <w:num w:numId="1020">
+    <w:abstractNumId w:val="991"/>
+  </w:num>
+  <w:num w:numId="1021">
+    <w:abstractNumId w:val="991"/>
+  </w:num>
+  <w:num w:numId="1022">
     <w:abstractNumId w:val="99411"/>
     <w:lvlOverride w:ilvl="0">
       <w:startOverride w:val="1"/>
@@ -3286,7 +3914,7 @@
       <w:startOverride w:val="1"/>
     </w:lvlOverride>
   </w:num>
-  <w:num w:numId="1014">
+  <w:num w:numId="1023">
     <w:abstractNumId w:val="99411"/>
     <w:lvlOverride w:ilvl="0">
       <w:startOverride w:val="1"/>
@@ -3316,7 +3944,7 @@
       <w:startOverride w:val="1"/>
     </w:lvlOverride>
   </w:num>
-  <w:num w:numId="1015">
+  <w:num w:numId="1024">
     <w:abstractNumId w:val="991"/>
   </w:num>
 </w:numbering>

</xml_diff>